<commit_message>
review introduction + re-render
</commit_message>
<xml_diff>
--- a/results/table_1.docx
+++ b/results/table_1.docx
@@ -187,7 +187,7 @@
                 <w:rFonts w:ascii="Calibri" w:hAnsi="Calibri"/>
                 <w:sz w:val="20"/>
               </w:rPr>
-              <w:t xml:space="default">0.29</w:t>
+              <w:t xml:space="default">NA</w:t>
             </w:r>
           </w:p>
         </w:tc>
@@ -211,7 +211,7 @@
                 <w:rFonts w:ascii="Calibri" w:hAnsi="Calibri"/>
                 <w:sz w:val="20"/>
               </w:rPr>
-              <w:t xml:space="default">0.18</w:t>
+              <w:t xml:space="default">NA</w:t>
             </w:r>
           </w:p>
         </w:tc>
@@ -265,7 +265,7 @@
                 <w:rFonts w:ascii="Calibri" w:hAnsi="Calibri"/>
                 <w:sz w:val="20"/>
               </w:rPr>
-              <w:t xml:space="default">0.08</w:t>
+              <w:t xml:space="default">NA</w:t>
             </w:r>
           </w:p>
         </w:tc>
@@ -289,7 +289,7 @@
                 <w:rFonts w:ascii="Calibri" w:hAnsi="Calibri"/>
                 <w:sz w:val="20"/>
               </w:rPr>
-              <w:t xml:space="default">0.08</w:t>
+              <w:t xml:space="default">NA</w:t>
             </w:r>
           </w:p>
         </w:tc>

</xml_diff>